<commit_message>
feat: sustituir correo por usuario y permitir claves desde ocho caracteres
</commit_message>
<xml_diff>
--- a/tallerbus/docs/manuales/Manual_empleados_TallerBus.docx
+++ b/tallerbus/docs/manuales/Manual_empleados_TallerBus.docx
@@ -29,16 +29,16 @@
         <w:rPr>
           <w:sz w:val="26"/>
         </w:rPr>
-        <w:t>Guía completa • Edición 1.0</w:t>
+        <w:t>Guía completa • Edición 2.0</w:t>
       </w:r>
     </w:p>
     <w:p>
       <w:r>
-        <w:t>22 de octubre de 2026</w:t>
+        <w:t>27 de octubre de 2026</w:t>
         <w:br/>
         <w:t>Repositorio: UP240248/nontaller</w:t>
         <w:br/>
-        <w:t>Referencia documental: e4a2192</w:t>
+        <w:t>Referencia documental: base e4a2192 + actualización de acceso del 27/10/2026</w:t>
         <w:br/>
         <w:t>Alcance: uso personal local en Windows</w:t>
       </w:r>
@@ -331,7 +331,7 @@
     </w:p>
     <w:p>
       <w:r>
-        <w:t>Esta edición corresponde al código e4a2192, revisado el 22 de octubre de 2026. El uso actual es personal y local en la computadora del responsable; no se ha publicado en la red de la empresa. Las instrucciones por empleado sirven para operar con las cuentas de cada rol cuando se configure ese acceso. Los datos de los ejemplos son ficticios y no vienen cargados en el sistema.</w:t>
+        <w:t>Esta edición corresponde al código base e4a2192 + actualización de acceso del 27/10/2026, revisado el 27 de octubre de 2026. El uso actual es personal y local en la computadora del responsable; no se ha publicado en la red de la empresa. Las instrucciones por empleado sirven para operar con las cuentas de cada rol cuando se configure ese acceso. Los datos de los ejemplos son ficticios y no vienen cargados en el sistema.</w:t>
       </w:r>
     </w:p>
     <w:p>
@@ -799,7 +799,7 @@
     </w:p>
     <w:p>
       <w:r>
-        <w:t>1. Escribe el correo exacto que registró Administración.</w:t>
+        <w:t>1. Escribe el usuario de acceso exacto que registró Administración.</w:t>
       </w:r>
     </w:p>
     <w:p>
@@ -819,12 +819,12 @@
     </w:p>
     <w:p>
       <w:r>
-        <w:t>El mensaje de acceso inválido no indica si el correo existe. Tras varios intentos fallidos, el sistema puede pedir esperar; no sigas intentando continuamente. En uso local la ventana técnica predeterminada es de 10 intentos por IP por minuto, sujeta a configuración.</w:t>
+        <w:t>El mensaje de acceso inválido no indica si el usuario existe. Tras varios intentos fallidos, el sistema puede pedir esperar; no sigas intentando continuamente. En uso local la ventana técnica predeterminada es de 10 intentos por IP por minuto, sujeta a configuración.</w:t>
       </w:r>
     </w:p>
     <w:p>
       <w:r>
-        <w:t>No hay recuperación automática por correo. Si olvidaste la contraseña, avisa al responsable; Administración puede gestionar usuarios y sesiones, pero no hay una pantalla implementada de restablecimiento de contraseña. No entregues tu contraseña para pedir ayuda.</w:t>
+        <w:t>No hay recuperación automática de contraseña. Si olvidaste la contraseña, avisa al responsable; Administración puede gestionar usuarios y sesiones, pero no hay una pantalla implementada de restablecimiento de contraseña. No entregues tu contraseña para pedir ayuda.</w:t>
       </w:r>
     </w:p>
     <w:p>
@@ -842,7 +842,7 @@
     </w:p>
     <w:p>
       <w:r>
-        <w:t>El primer registro exige nombre de 2–100 caracteres, correo válido y contraseña de 12–128 caracteres repetida exactamente. El correo identifica la cuenta; no se manda un correo de verificación. Al escribir contraseña en la terminal no aparecen letras ni asteriscos.</w:t>
+        <w:t>El primer registro exige nombre de 2–100 caracteres, usuario válido de 3–40 caracteres y contraseña de 8–128 caracteres repetida exactamente. La cuenta se identifica mediante su usuario de acceso. Al escribir contraseña en la terminal no aparecen letras ni asteriscos.</w:t>
       </w:r>
     </w:p>
     <w:p>
@@ -983,7 +983,7 @@
     </w:p>
     <w:p>
       <w:r>
-        <w:t>2. Captura nombre, correo único, rol y contraseña inicial de 12–128 caracteres.</w:t>
+        <w:t>2. Captura nombre, usuario de acceso único, rol y contraseña inicial de 8–128 caracteres.</w:t>
       </w:r>
     </w:p>
     <w:p>
@@ -1016,7 +1016,7 @@
     </w:p>
     <w:p>
       <w:r>
-        <w:t>Puedes modificar nombre, correo o rol. Un cambio de rol cierra las sesiones previas. Desactivar impide nuevos accesos y cierra sesiones sin borrar historia. Activar vuelve a permitir el acceso. Revocar sesiones cierra los accesos actuales sin eliminar la cuenta.</w:t>
+        <w:t>Puedes modificar nombre, usuario o rol. Un cambio de rol cierra las sesiones previas. Desactivar impide nuevos accesos y cierra sesiones sin borrar historia. Activar vuelve a permitir el acceso. Revocar sesiones cierra los accesos actuales sin eliminar la cuenta.</w:t>
       </w:r>
     </w:p>
     <w:p>
@@ -2679,7 +2679,7 @@
                 <w:color w:val="253746"/>
                 <w:sz w:val="18"/>
               </w:rPr>
-              <w:t>Revisar obligatorios, longitudes, correo, formato y signos de cantidades</w:t>
+              <w:t>Revisar obligatorios, longitudes, usuario, formato y signos de cantidades</w:t>
             </w:r>
           </w:p>
         </w:tc>
@@ -2724,7 +2724,7 @@
                 <w:color w:val="253746"/>
                 <w:sz w:val="18"/>
               </w:rPr>
-              <w:t>Verificar correo, mayúsculas y teclado; no compartir la contraseña</w:t>
+              <w:t>Verificar usuario, mayúsculas y teclado; no compartir la contraseña</w:t>
             </w:r>
           </w:p>
         </w:tc>
@@ -3486,7 +3486,7 @@
         <w:pStyle w:val="ListBullet"/>
       </w:pPr>
       <w:r>
-        <w:t>Cuenta creada con correo único y rol correcto; datos de acceso entregados por canal seguro.</w:t>
+        <w:t>Cuenta creada con usuario de acceso único y rol correcto; datos de acceso entregados por canal seguro.</w:t>
       </w:r>
     </w:p>
     <w:p>
@@ -4687,12 +4687,45 @@
     </w:p>
     <w:p>
       <w:r>
-        <w:t>No hay soporte externo automático contratado, recuperación por correo ni notificaciones externas implementadas. El contacto es el responsable que administra la instalación. Este manual no autoriza publicar TallerBus en la red empresarial ni sustituye las instrucciones de seguridad del taller.</w:t>
+        <w:t>No hay soporte externo automático contratado, recuperación automática de contraseña ni notificaciones externas implementadas. El contacto es el responsable que administra la instalación. Este manual no autoriza publicar TallerBus en la red empresarial ni sustituye las instrucciones de seguridad del taller.</w:t>
       </w:r>
     </w:p>
     <w:p>
       <w:r>
         <w:t>Para pedir ayuda, comunica pantalla, acción, hora y mensaje; adjunta captura saneada. Nunca envíes tu contraseña, archivos .local, SQL de respaldo o cookies. Si se necesita una función nueva, descríbela como solicitud de mejora en lugar de alterar registros para simularla.</w:t>
+      </w:r>
+    </w:p>
+    <w:p>
+      <w:r>
+        <w:br w:type="page"/>
+      </w:r>
+    </w:p>
+    <w:p>
+      <w:pPr>
+        <w:pStyle w:val="Heading1"/>
+      </w:pPr>
+      <w:r>
+        <w:t>Actualización de acceso — 27 de octubre de 2026</w:t>
+      </w:r>
+    </w:p>
+    <w:p>
+      <w:r>
+        <w:t>El inicio de sesión usa usuario y contraseña. Crear una cuenta requiere nombre del empleado, usuario de acceso y contraseña de 8–128 caracteres, más el rol autorizado. Administración consulta nombre, usuario, rol y estado en columnas separadas. Las contraseñas no se pueden ver en texto ni recuperar de su hash.</w:t>
+      </w:r>
+    </w:p>
+    <w:p>
+      <w:r>
+        <w:t>Usuario de acceso: 3–40 letras sin acentos, números, puntos, guiones o guiones bajos; inicio alfanumérico, sin espacios interiores, normalización a minúsculas. Ejemplo: juan.perez. El nombre del empleado sí puede llevar espacios y acentos.</w:t>
+      </w:r>
+    </w:p>
+    <w:p>
+      <w:r>
+        <w:t>Las cuentas existentes conservan su contraseña. La migración deriva el usuario de la parte anterior al @; resuelve duplicados con un identificador único. Antes de actualizar, detener la aplicación y crear/verificar respaldo. Después de git pull --ff-only y npm.cmd run setup, ejecutar npm.cmd run users:local para consultar el usuario asignado; no repetir bootstrap si ya hay administrador.</w:t>
+      </w:r>
+    </w:p>
+    <w:p>
+      <w:r>
+        <w:t>Para la demo usar npm.cmd run demo:setup; actualiza su archivo privado de cuentas sin cambiar contraseñas. El archivo contiene username y password. No compartirlo. Guía detallada del repositorio: docs/acceso-por-usuario.md.</w:t>
       </w:r>
     </w:p>
     <w:sectPr>
@@ -4720,7 +4753,7 @@
         <w:color w:val="61717C"/>
         <w:sz w:val="16"/>
       </w:rPr>
-      <w:t xml:space="preserve">Edición 1.0 · 22/10/2026   |   Página </w:t>
+      <w:t xml:space="preserve">Edición 2.0 · 27/10/2026   |   Página  de </w:t>
     </w:r>
     <w:r>
       <w:rPr>
@@ -4734,7 +4767,6 @@
         <w:color w:val="61717C"/>
         <w:sz w:val="16"/>
       </w:rPr>
-      <w:t xml:space="preserve"> de </w:t>
     </w:r>
     <w:r>
       <w:rPr>

</xml_diff>

<commit_message>
feat: reorganizar inventario y simplificar consultas de contabilidad
</commit_message>
<xml_diff>
--- a/tallerbus/docs/manuales/Manual_empleados_TallerBus.docx
+++ b/tallerbus/docs/manuales/Manual_empleados_TallerBus.docx
@@ -4728,6 +4728,182 @@
         <w:t>Para la demo usar npm.cmd run demo:setup; actualiza su archivo privado de cuentas sin cambiar contraseñas. El archivo contiene username y password. No compartirlo. Guía detallada del repositorio: docs/acceso-por-usuario.md.</w:t>
       </w:r>
     </w:p>
+    <w:p>
+      <w:r>
+        <w:br w:type="page"/>
+      </w:r>
+    </w:p>
+    <w:p>
+      <w:pPr>
+        <w:pStyle w:val="Heading1"/>
+      </w:pPr>
+      <w:r>
+        <w:t>Actualización de Inventario — 28 de octubre de 2026</w:t>
+      </w:r>
+    </w:p>
+    <w:p>
+      <w:r>
+        <w:t>Este anexo sustituye las instrucciones de navegación de Inventario anteriores. No cambia reglas de permisos, costos o stock. No se agregan migraciones.</w:t>
+      </w:r>
+    </w:p>
+    <w:tbl>
+      <w:tblPr>
+        <w:tblStyle w:val="LightShading-Accent1"/>
+        <w:tblW w:type="auto" w:w="0"/>
+        <w:tblLook w:firstColumn="1" w:firstRow="1" w:lastColumn="0" w:lastRow="0" w:noHBand="0" w:noVBand="1" w:val="04A0"/>
+      </w:tblPr>
+      <w:tblGrid>
+        <w:gridCol w:w="4790"/>
+        <w:gridCol w:w="4790"/>
+      </w:tblGrid>
+      <w:tr>
+        <w:tc>
+          <w:tcPr>
+            <w:tcW w:type="dxa" w:w="4790"/>
+          </w:tcPr>
+          <w:p>
+            <w:r>
+              <w:t>Rol o tarea</w:t>
+            </w:r>
+          </w:p>
+        </w:tc>
+        <w:tc>
+          <w:tcPr>
+            <w:tcW w:type="dxa" w:w="4790"/>
+          </w:tcPr>
+          <w:p>
+            <w:r>
+              <w:t>Dónde entrar / qué hacer</w:t>
+            </w:r>
+          </w:p>
+        </w:tc>
+      </w:tr>
+      <w:tr>
+        <w:tc>
+          <w:tcPr>
+            <w:tcW w:type="dxa" w:w="4790"/>
+          </w:tcPr>
+          <w:p>
+            <w:r>
+              <w:t>Contabilidad</w:t>
+            </w:r>
+          </w:p>
+        </w:tc>
+        <w:tc>
+          <w:tcPr>
+            <w:tcW w:type="dxa" w:w="4790"/>
+          </w:tcPr>
+          <w:p>
+            <w:r>
+              <w:t>Inventario (consulta) y Compras (consulta), en menú o Mi espacio. El reporte se selecciona automáticamente; consultar, filtrar y exportar. No registra movimientos.</w:t>
+            </w:r>
+          </w:p>
+        </w:tc>
+      </w:tr>
+      <w:tr>
+        <w:tc>
+          <w:tcPr>
+            <w:tcW w:type="dxa" w:w="4790"/>
+          </w:tcPr>
+          <w:p>
+            <w:r>
+              <w:t>Logística: existencias</w:t>
+            </w:r>
+          </w:p>
+        </w:tc>
+        <w:tc>
+          <w:tcPr>
+            <w:tcW w:type="dxa" w:w="4790"/>
+          </w:tcPr>
+          <w:p>
+            <w:r>
+              <w:t>Inventario → Existencias. Buscar no modifica los formularios. Entrada y Entregar de cada fila preseleccionan la pieza.</w:t>
+            </w:r>
+          </w:p>
+        </w:tc>
+      </w:tr>
+      <w:tr>
+        <w:tc>
+          <w:tcPr>
+            <w:tcW w:type="dxa" w:w="4790"/>
+          </w:tcPr>
+          <w:p>
+            <w:r>
+              <w:t>Logística: movimientos</w:t>
+            </w:r>
+          </w:p>
+        </w:tc>
+        <w:tc>
+          <w:tcPr>
+            <w:tcW w:type="dxa" w:w="4790"/>
+          </w:tcPr>
+          <w:p>
+            <w:r>
+              <w:t>Inventario → Movimientos. Buscar por código, descripción, unidad u orden; filtrar por tipo. Devolver sobrantes permite encontrar entregas antiguas y muestra el máximo permitido.</w:t>
+            </w:r>
+          </w:p>
+        </w:tc>
+      </w:tr>
+      <w:tr>
+        <w:tc>
+          <w:tcPr>
+            <w:tcW w:type="dxa" w:w="4790"/>
+          </w:tcPr>
+          <w:p>
+            <w:r>
+              <w:t>Logística: compras</w:t>
+            </w:r>
+          </w:p>
+        </w:tc>
+        <w:tc>
+          <w:tcPr>
+            <w:tcW w:type="dxa" w:w="4790"/>
+          </w:tcPr>
+          <w:p>
+            <w:r>
+              <w:t>Compras tiene acceso propio. Nueva compra → Guardar borrador → Aprobar → Recibir ahora. Se muestra pedido, recibido y pendiente. Cancelar requiere motivo y confirmación.</w:t>
+            </w:r>
+          </w:p>
+        </w:tc>
+      </w:tr>
+      <w:tr>
+        <w:tc>
+          <w:tcPr>
+            <w:tcW w:type="dxa" w:w="4790"/>
+          </w:tcPr>
+          <w:p>
+            <w:r>
+              <w:t>Administración/Mecánico</w:t>
+            </w:r>
+          </w:p>
+        </w:tc>
+        <w:tc>
+          <w:tcPr>
+            <w:tcW w:type="dxa" w:w="4790"/>
+          </w:tcPr>
+          <w:p>
+            <w:r>
+              <w:t>Consultan existencias sin importes. Logística sigue registrando operaciones.</w:t>
+            </w:r>
+          </w:p>
+        </w:tc>
+      </w:tr>
+    </w:tbl>
+    <w:p>
+      <w:r>
+        <w:t>Los cuatro botones de almacén abren solo el formulario correspondiente: entrada, entrega a orden, devolución y ajuste de conteo. Cantidades positivas hasta tres decimales, salvo ajuste con signo; costos no negativos hasta seis decimales. Mensajes de error dentro del formulario. No se admiten piezas repetidas en una compra ni recibir/devolver por encima de lo permitido.</w:t>
+      </w:r>
+    </w:p>
+    <w:p>
+      <w:r>
+        <w:t>Código de refacción (SKU) es el identificador que tú asignas, por ejemplo FIL-001. No necesita código de barras. Los enlaces de registro dentro de formularios abren el catálogo en otra pestaña; vuelve y busca para actualizar opciones. Cerrar sin guardar no crea una compra en BD ni conserva datos al salir de la página.</w:t>
+      </w:r>
+    </w:p>
+    <w:p>
+      <w:r>
+        <w:t>La misma refacción no se vuelve a descontar al cerrar una orden. Recibir una compra no debe duplicarse con una entrada directa. Pendiente de devolver es el máximo que se puede devolver, no una obligación de regresar piezas usadas. Guía del repositorio: docs/inventario-guia-rapida.md.</w:t>
+      </w:r>
+    </w:p>
     <w:sectPr>
       <w:headerReference w:type="default" r:id="rId9"/>
       <w:footerReference w:type="default" r:id="rId10"/>

</xml_diff>